<commit_message>
feat(bcbs-vt): pandoc styleId coverage 0% → 100%, BCBS typography
style-proposal-report.py rewritten: upserts every missing pandoc
paragraph styleId by XML styleId attribute (Title, Subtitle, Author,
Date, Heading2-4, BodyText, FirstParagraph, Compact, Caption,
IntenseQuote) and injects a Table table-type style via raw lxml.
Heading1 left untouched — the template's blue-band look is the
BCBS visual signature.

SKILL.md bumped v1.3.0 → v1.4.0 with new "Canonical markdown shape
for BCBS .docx output" section. reference-proposal-report.docx
regenerated and verified. Plugin bumped 3.5.8 → 3.5.9. Sync run.
</commit_message>
<xml_diff>
--- a/plugins/ames-standalone-skills/skills/bcbs-vt/data/letterhead/assets/reference-proposal-report.docx
+++ b/plugins/ames-standalone-skills/skills/bcbs-vt/data/letterhead/assets/reference-proposal-report.docx
@@ -1167,110 +1167,195 @@
       <w:contextualSpacing/>
     </w:pPr>
   </w:style>
-  <w:style w:type="paragraph" w:customStyle="1" w:styleId="Heading2">
-    <w:name w:val="heading 2"/>
+  <w:style w:type="paragraph" w:styleId="Title">
+    <w:name w:val="Title"/>
+    <w:basedOn w:val="Normal"/>
+    <w:qFormat/>
     <w:pPr>
-      <w:spacing w:before="200" w:after="80"/>
+      <w:spacing w:before="0" w:after="0" w:line="276" w:lineRule="auto"/>
     </w:pPr>
     <w:rPr>
-      <w:rFonts w:ascii="Arial" w:hAnsi="Arial"/>
+      <w:rFonts w:ascii="Calibri" w:hAnsi="Calibri" w:cs="Calibri"/>
       <w:b/>
-      <w:color w:val="0077C8"/>
-      <w:sz w:val="36"/>
+      <w:color w:val="00355E"/>
+      <w:sz w:val="30"/>
+      <w:szCs w:val="30"/>
     </w:rPr>
   </w:style>
-  <w:style w:type="paragraph" w:customStyle="1" w:styleId="Heading3">
-    <w:name w:val="heading 3"/>
+  <w:style w:type="paragraph" w:styleId="Subtitle">
+    <w:name w:val="Subtitle"/>
+    <w:basedOn w:val="Normal"/>
+    <w:qFormat/>
     <w:pPr>
-      <w:spacing w:before="160" w:after="80"/>
+      <w:spacing w:before="0" w:after="240" w:line="288" w:lineRule="auto"/>
     </w:pPr>
     <w:rPr>
-      <w:rFonts w:ascii="Arial" w:hAnsi="Arial"/>
-      <w:b/>
-      <w:color w:val="0077C8"/>
-      <w:sz w:val="28"/>
+      <w:rFonts w:ascii="Calibri" w:hAnsi="Calibri" w:cs="Calibri"/>
+      <w:color w:val="595959"/>
+      <w:sz w:val="16"/>
+      <w:szCs w:val="16"/>
     </w:rPr>
   </w:style>
-  <w:style w:type="paragraph" w:customStyle="1" w:styleId="Heading4">
-    <w:name w:val="heading 4"/>
-    <w:pPr>
-      <w:spacing w:before="120" w:after="40"/>
-    </w:pPr>
-    <w:rPr>
-      <w:rFonts w:ascii="Arial" w:hAnsi="Arial"/>
-      <w:b/>
-      <w:color w:val="0077C8"/>
-      <w:sz w:val="24"/>
-    </w:rPr>
-  </w:style>
-  <w:style w:type="paragraph" w:customStyle="1" w:styleId="Title">
-    <w:name w:val="Title"/>
-    <w:pPr>
-      <w:spacing w:before="0" w:after="80"/>
-    </w:pPr>
-    <w:rPr>
-      <w:rFonts w:ascii="Arial" w:hAnsi="Arial"/>
-      <w:b/>
-      <w:color w:val="00467B"/>
-      <w:sz w:val="56"/>
-    </w:rPr>
-  </w:style>
-  <w:style w:type="paragraph" w:customStyle="1" w:styleId="Author">
+  <w:style w:type="paragraph" w:styleId="Author">
     <w:name w:val="Author"/>
+    <w:basedOn w:val="Normal"/>
+    <w:qFormat/>
     <w:pPr>
       <w:spacing w:after="40"/>
     </w:pPr>
     <w:rPr>
-      <w:rFonts w:ascii="Calibri" w:hAnsi="Calibri"/>
-      <w:b w:val="0"/>
+      <w:rFonts w:ascii="Calibri" w:hAnsi="Calibri" w:cs="Calibri"/>
       <w:color w:val="63666A"/>
-      <w:sz w:val="22"/>
+      <w:sz w:val="20"/>
+      <w:szCs w:val="20"/>
     </w:rPr>
   </w:style>
-  <w:style w:type="paragraph" w:customStyle="1" w:styleId="Date">
+  <w:style w:type="paragraph" w:styleId="Date">
     <w:name w:val="Date"/>
+    <w:basedOn w:val="Normal"/>
+    <w:qFormat/>
     <w:pPr>
       <w:spacing w:after="240"/>
     </w:pPr>
     <w:rPr>
-      <w:rFonts w:ascii="Calibri" w:hAnsi="Calibri"/>
-      <w:b w:val="0"/>
+      <w:rFonts w:ascii="Calibri" w:hAnsi="Calibri" w:cs="Calibri"/>
       <w:color w:val="63666A"/>
-      <w:sz w:val="22"/>
+      <w:sz w:val="20"/>
+      <w:szCs w:val="20"/>
     </w:rPr>
   </w:style>
-  <w:style w:type="paragraph" w:customStyle="1" w:styleId="BodyText">
-    <w:name w:val="Body Text"/>
+  <w:style w:type="paragraph" w:styleId="Heading2">
+    <w:name w:val="heading 2"/>
+    <w:basedOn w:val="Normal"/>
+    <w:qFormat/>
     <w:pPr>
-      <w:spacing w:after="120"/>
+      <w:spacing w:before="240" w:after="80" w:line="276" w:lineRule="auto"/>
     </w:pPr>
     <w:rPr>
-      <w:rFonts w:ascii="Calibri" w:hAnsi="Calibri"/>
-      <w:b w:val="0"/>
-      <w:color w:val="1A1A1A"/>
+      <w:rFonts w:ascii="Calibri" w:hAnsi="Calibri" w:cs="Calibri"/>
+      <w:b/>
+      <w:color w:val="00355E"/>
+      <w:sz w:val="24"/>
+      <w:szCs w:val="24"/>
+    </w:rPr>
+  </w:style>
+  <w:style w:type="paragraph" w:styleId="Heading3">
+    <w:name w:val="heading 3"/>
+    <w:basedOn w:val="Normal"/>
+    <w:qFormat/>
+    <w:pPr>
+      <w:spacing w:before="160" w:after="40" w:line="276" w:lineRule="auto"/>
+    </w:pPr>
+    <w:rPr>
+      <w:rFonts w:ascii="Calibri" w:hAnsi="Calibri" w:cs="Calibri"/>
+      <w:b/>
+      <w:color w:val="0077C8"/>
       <w:sz w:val="22"/>
+      <w:szCs w:val="22"/>
     </w:rPr>
   </w:style>
-  <w:style w:type="paragraph" w:customStyle="1" w:styleId="Caption">
+  <w:style w:type="paragraph" w:styleId="Heading4">
+    <w:name w:val="heading 4"/>
+    <w:basedOn w:val="Normal"/>
+    <w:qFormat/>
+    <w:pPr>
+      <w:spacing w:before="120" w:after="40" w:line="276" w:lineRule="auto"/>
+    </w:pPr>
+    <w:rPr>
+      <w:rFonts w:ascii="Calibri" w:hAnsi="Calibri" w:cs="Calibri"/>
+      <w:b/>
+      <w:i/>
+      <w:color w:val="0077C8"/>
+      <w:sz w:val="22"/>
+      <w:szCs w:val="22"/>
+    </w:rPr>
+  </w:style>
+  <w:style w:type="paragraph" w:styleId="BodyText">
+    <w:name w:val="Body Text"/>
+    <w:basedOn w:val="Normal"/>
+    <w:qFormat/>
+  </w:style>
+  <w:style w:type="paragraph" w:styleId="FirstParagraph">
+    <w:name w:val="First Paragraph"/>
+    <w:basedOn w:val="Normal"/>
+    <w:qFormat/>
+    <w:pPr>
+      <w:spacing w:before="0"/>
+    </w:pPr>
+  </w:style>
+  <w:style w:type="paragraph" w:styleId="Compact">
+    <w:name w:val="Compact"/>
+    <w:basedOn w:val="Normal"/>
+    <w:qFormat/>
+    <w:pPr>
+      <w:spacing w:before="0" w:after="0" w:line="276" w:lineRule="auto"/>
+    </w:pPr>
+  </w:style>
+  <w:style w:type="paragraph" w:styleId="Caption">
     <w:name w:val="caption"/>
+    <w:basedOn w:val="Normal"/>
+    <w:qFormat/>
     <w:rPr>
-      <w:rFonts w:ascii="Calibri" w:hAnsi="Calibri"/>
-      <w:b w:val="0"/>
+      <w:rFonts w:ascii="Calibri" w:hAnsi="Calibri" w:cs="Calibri"/>
+      <w:i/>
       <w:color w:val="63666A"/>
-      <w:sz w:val="20"/>
+      <w:sz w:val="18"/>
+      <w:szCs w:val="18"/>
     </w:rPr>
   </w:style>
-  <w:style w:type="paragraph" w:customStyle="1" w:styleId="IntenseQuote">
+  <w:style w:type="paragraph" w:styleId="IntenseQuote">
     <w:name w:val="Intense Quote"/>
+    <w:basedOn w:val="Normal"/>
+    <w:qFormat/>
     <w:pPr>
       <w:spacing w:before="160" w:after="160"/>
     </w:pPr>
     <w:rPr>
-      <w:rFonts w:ascii="Calibri" w:hAnsi="Calibri"/>
-      <w:b w:val="0"/>
-      <w:color w:val="0077C8"/>
-      <w:sz w:val="22"/>
+      <w:rFonts w:ascii="Calibri" w:hAnsi="Calibri" w:cs="Calibri"/>
+      <w:i/>
+      <w:color w:val="00355E"/>
+      <w:sz w:val="20"/>
+      <w:szCs w:val="20"/>
     </w:rPr>
+  </w:style>
+  <w:style w:type="table" w:styleId="Table">
+    <w:name w:val="Table"/>
+    <w:basedOn w:val="TableNormal"/>
+    <w:uiPriority w:val="59"/>
+    <w:qFormat/>
+    <w:pPr>
+      <w:spacing w:before="40" w:after="40" w:line="240" w:lineRule="auto"/>
+    </w:pPr>
+    <w:rPr>
+      <w:rFonts w:ascii="Calibri" w:hAnsi="Calibri" w:cs="Calibri"/>
+      <w:sz w:val="20"/>
+      <w:szCs w:val="20"/>
+    </w:rPr>
+    <w:tblPr>
+      <w:tblBorders>
+        <w:top w:val="single" w:sz="4" w:space="0" w:color="BFBFBF"/>
+        <w:left w:val="single" w:sz="4" w:space="0" w:color="BFBFBF"/>
+        <w:bottom w:val="single" w:sz="4" w:space="0" w:color="BFBFBF"/>
+        <w:right w:val="single" w:sz="4" w:space="0" w:color="BFBFBF"/>
+        <w:insideH w:val="single" w:sz="4" w:space="0" w:color="BFBFBF"/>
+        <w:insideV w:val="single" w:sz="4" w:space="0" w:color="BFBFBF"/>
+      </w:tblBorders>
+      <w:tblCellMar>
+        <w:top w:w="80" w:type="dxa"/>
+        <w:left w:w="120" w:type="dxa"/>
+        <w:bottom w:w="80" w:type="dxa"/>
+        <w:right w:w="120" w:type="dxa"/>
+      </w:tblCellMar>
+    </w:tblPr>
+    <w:tblStylePr w:type="firstRow">
+      <w:rPr>
+        <w:b/>
+        <w:color w:val="00355E"/>
+      </w:rPr>
+      <w:tcPr>
+        <w:shd w:val="clear" w:color="auto" w:fill="E6F2FA"/>
+      </w:tcPr>
+    </w:tblStylePr>
   </w:style>
 </w:styles>
 </file>

</xml_diff>